<commit_message>
add stages e VUs para execuçãodo teste
</commit_message>
<xml_diff>
--- a/Documentation/QA PLAN & STRATEGY/Epic002 - Plan& Strategy of Tests.docx
+++ b/Documentation/QA PLAN & STRATEGY/Epic002 - Plan& Strategy of Tests.docx
@@ -789,14 +789,7 @@
           <w:b w:val="1"/>
           <w:rtl w:val="0"/>
         </w:rPr>
-        <w:t xml:space="preserve">US004</w:t>
-      </w:r>
-      <w:r>
-        <w:rPr>
-          <w:b w:val="1"/>
-          <w:rtl w:val="0"/>
-        </w:rPr>
-        <w:t xml:space="preserve">: </w:t>
+        <w:t xml:space="preserve">US004: </w:t>
       </w:r>
       <w:r>
         <w:rPr>
@@ -1920,6 +1913,11 @@
         </w:rPr>
         <w:t xml:space="preserve">Test Char Limit Cenarios</w:t>
       </w:r>
+      <w:r>
+        <w:rPr>
+          <w:rtl w:val="0"/>
+        </w:rPr>
+      </w:r>
     </w:p>
     <w:p>
       <w:pPr>
@@ -1952,6 +1950,11 @@
         </w:rPr>
         <w:t xml:space="preserve">Test Field masks like Date, CPF and CRP</w:t>
       </w:r>
+      <w:r>
+        <w:rPr>
+          <w:rtl w:val="0"/>
+        </w:rPr>
+      </w:r>
     </w:p>
     <w:p>
       <w:pPr>
@@ -1984,6 +1987,11 @@
         </w:rPr>
         <w:t xml:space="preserve">Test multiple Invalid Data</w:t>
       </w:r>
+      <w:r>
+        <w:rPr>
+          <w:rtl w:val="0"/>
+        </w:rPr>
+      </w:r>
     </w:p>
     <w:p>
       <w:pPr>
@@ -2016,101 +2024,6 @@
         </w:rPr>
         <w:t xml:space="preserve">Validation messages</w:t>
       </w:r>
-    </w:p>
-    <w:p>
-      <w:pPr>
-        <w:keepNext w:val="0"/>
-        <w:keepLines w:val="0"/>
-        <w:pageBreakBefore w:val="0"/>
-        <w:widowControl w:val="1"/>
-        <w:pBdr>
-          <w:top w:space="0" w:sz="0" w:val="nil"/>
-          <w:left w:space="0" w:sz="0" w:val="nil"/>
-          <w:bottom w:space="0" w:sz="0" w:val="nil"/>
-          <w:right w:space="0" w:sz="0" w:val="nil"/>
-          <w:between w:space="0" w:sz="0" w:val="nil"/>
-        </w:pBdr>
-        <w:shd w:fill="auto" w:val="clear"/>
-        <w:spacing w:after="0" w:before="0" w:line="240" w:lineRule="auto"/>
-        <w:ind w:right="0"/>
-        <w:jc w:val="left"/>
-        <w:rPr/>
-      </w:pPr>
-      <w:r>
-        <w:rPr>
-          <w:rtl w:val="0"/>
-        </w:rPr>
-      </w:r>
-    </w:p>
-    <w:p>
-      <w:pPr>
-        <w:keepNext w:val="0"/>
-        <w:keepLines w:val="0"/>
-        <w:pageBreakBefore w:val="0"/>
-        <w:widowControl w:val="1"/>
-        <w:pBdr>
-          <w:top w:space="0" w:sz="0" w:val="nil"/>
-          <w:left w:space="0" w:sz="0" w:val="nil"/>
-          <w:bottom w:space="0" w:sz="0" w:val="nil"/>
-          <w:right w:space="0" w:sz="0" w:val="nil"/>
-          <w:between w:space="0" w:sz="0" w:val="nil"/>
-        </w:pBdr>
-        <w:shd w:fill="auto" w:val="clear"/>
-        <w:spacing w:after="0" w:before="0" w:line="240" w:lineRule="auto"/>
-        <w:ind w:right="0"/>
-        <w:jc w:val="left"/>
-        <w:rPr/>
-      </w:pPr>
-      <w:r>
-        <w:rPr>
-          <w:rtl w:val="0"/>
-        </w:rPr>
-      </w:r>
-    </w:p>
-    <w:p>
-      <w:pPr>
-        <w:keepNext w:val="0"/>
-        <w:keepLines w:val="0"/>
-        <w:pageBreakBefore w:val="0"/>
-        <w:widowControl w:val="1"/>
-        <w:pBdr>
-          <w:top w:space="0" w:sz="0" w:val="nil"/>
-          <w:left w:space="0" w:sz="0" w:val="nil"/>
-          <w:bottom w:space="0" w:sz="0" w:val="nil"/>
-          <w:right w:space="0" w:sz="0" w:val="nil"/>
-          <w:between w:space="0" w:sz="0" w:val="nil"/>
-        </w:pBdr>
-        <w:shd w:fill="auto" w:val="clear"/>
-        <w:spacing w:after="0" w:before="0" w:line="240" w:lineRule="auto"/>
-        <w:ind w:right="0"/>
-        <w:jc w:val="left"/>
-        <w:rPr/>
-      </w:pPr>
-      <w:r>
-        <w:rPr>
-          <w:rtl w:val="0"/>
-        </w:rPr>
-      </w:r>
-    </w:p>
-    <w:p>
-      <w:pPr>
-        <w:keepNext w:val="0"/>
-        <w:keepLines w:val="0"/>
-        <w:pageBreakBefore w:val="0"/>
-        <w:widowControl w:val="1"/>
-        <w:pBdr>
-          <w:top w:space="0" w:sz="0" w:val="nil"/>
-          <w:left w:space="0" w:sz="0" w:val="nil"/>
-          <w:bottom w:space="0" w:sz="0" w:val="nil"/>
-          <w:right w:space="0" w:sz="0" w:val="nil"/>
-          <w:between w:space="0" w:sz="0" w:val="nil"/>
-        </w:pBdr>
-        <w:shd w:fill="auto" w:val="clear"/>
-        <w:spacing w:after="0" w:before="0" w:line="240" w:lineRule="auto"/>
-        <w:ind w:right="0"/>
-        <w:jc w:val="left"/>
-        <w:rPr/>
-      </w:pPr>
       <w:r>
         <w:rPr>
           <w:rtl w:val="0"/>
@@ -2139,17 +2052,7 @@
         <w:ind w:left="0" w:right="0" w:firstLine="0"/>
         <w:jc w:val="left"/>
         <w:rPr>
-          <w:rFonts w:ascii="Aptos" w:cs="Aptos" w:eastAsia="Aptos" w:hAnsi="Aptos"/>
           <w:b w:val="1"/>
-          <w:i w:val="0"/>
-          <w:smallCaps w:val="0"/>
-          <w:strike w:val="0"/>
-          <w:color w:val="000000"/>
-          <w:sz w:val="24"/>
-          <w:szCs w:val="24"/>
-          <w:u w:val="none"/>
-          <w:shd w:fill="auto" w:val="clear"/>
-          <w:vertAlign w:val="baseline"/>
         </w:rPr>
       </w:pPr>
       <w:r>
@@ -2413,21 +2316,6 @@
           <w:vertAlign w:val="baseline"/>
         </w:rPr>
       </w:pPr>
-      <w:r>
-        <w:rPr>
-          <w:rtl w:val="0"/>
-        </w:rPr>
-      </w:r>
-    </w:p>
-    <w:p>
-      <w:pPr>
-        <w:rPr>
-          <w:b w:val="1"/>
-        </w:rPr>
-      </w:pPr>
-      <w:r>
-        <w:br w:type="page"/>
-      </w:r>
       <w:r>
         <w:rPr>
           <w:rtl w:val="0"/>
@@ -3404,6 +3292,161 @@
         <w:ind w:left="0" w:right="0" w:firstLine="0"/>
         <w:jc w:val="left"/>
         <w:rPr>
+          <w:b w:val="1"/>
+        </w:rPr>
+      </w:pPr>
+      <w:r>
+        <w:rPr>
+          <w:rtl w:val="0"/>
+        </w:rPr>
+      </w:r>
+    </w:p>
+    <w:p>
+      <w:pPr>
+        <w:keepNext w:val="0"/>
+        <w:keepLines w:val="0"/>
+        <w:pageBreakBefore w:val="0"/>
+        <w:widowControl w:val="1"/>
+        <w:pBdr>
+          <w:top w:space="0" w:sz="0" w:val="nil"/>
+          <w:left w:space="0" w:sz="0" w:val="nil"/>
+          <w:bottom w:space="0" w:sz="0" w:val="nil"/>
+          <w:right w:space="0" w:sz="0" w:val="nil"/>
+          <w:between w:space="0" w:sz="0" w:val="nil"/>
+        </w:pBdr>
+        <w:shd w:fill="auto" w:val="clear"/>
+        <w:tabs>
+          <w:tab w:val="center" w:leader="none" w:pos="4680"/>
+          <w:tab w:val="right" w:leader="none" w:pos="9360"/>
+        </w:tabs>
+        <w:spacing w:after="0" w:before="0" w:line="240" w:lineRule="auto"/>
+        <w:ind w:left="0" w:right="0" w:firstLine="0"/>
+        <w:jc w:val="left"/>
+        <w:rPr>
+          <w:b w:val="1"/>
+        </w:rPr>
+      </w:pPr>
+      <w:r>
+        <w:rPr>
+          <w:rtl w:val="0"/>
+        </w:rPr>
+      </w:r>
+    </w:p>
+    <w:p>
+      <w:pPr>
+        <w:keepNext w:val="0"/>
+        <w:keepLines w:val="0"/>
+        <w:pageBreakBefore w:val="0"/>
+        <w:widowControl w:val="1"/>
+        <w:pBdr>
+          <w:top w:space="0" w:sz="0" w:val="nil"/>
+          <w:left w:space="0" w:sz="0" w:val="nil"/>
+          <w:bottom w:space="0" w:sz="0" w:val="nil"/>
+          <w:right w:space="0" w:sz="0" w:val="nil"/>
+          <w:between w:space="0" w:sz="0" w:val="nil"/>
+        </w:pBdr>
+        <w:shd w:fill="auto" w:val="clear"/>
+        <w:tabs>
+          <w:tab w:val="center" w:leader="none" w:pos="4680"/>
+          <w:tab w:val="right" w:leader="none" w:pos="9360"/>
+        </w:tabs>
+        <w:spacing w:after="0" w:before="0" w:line="240" w:lineRule="auto"/>
+        <w:ind w:left="0" w:right="0" w:firstLine="0"/>
+        <w:jc w:val="left"/>
+        <w:rPr>
+          <w:b w:val="1"/>
+        </w:rPr>
+      </w:pPr>
+      <w:r>
+        <w:rPr>
+          <w:rtl w:val="0"/>
+        </w:rPr>
+      </w:r>
+    </w:p>
+    <w:p>
+      <w:pPr>
+        <w:keepNext w:val="0"/>
+        <w:keepLines w:val="0"/>
+        <w:pageBreakBefore w:val="0"/>
+        <w:widowControl w:val="1"/>
+        <w:pBdr>
+          <w:top w:space="0" w:sz="0" w:val="nil"/>
+          <w:left w:space="0" w:sz="0" w:val="nil"/>
+          <w:bottom w:space="0" w:sz="0" w:val="nil"/>
+          <w:right w:space="0" w:sz="0" w:val="nil"/>
+          <w:between w:space="0" w:sz="0" w:val="nil"/>
+        </w:pBdr>
+        <w:shd w:fill="auto" w:val="clear"/>
+        <w:tabs>
+          <w:tab w:val="center" w:leader="none" w:pos="4680"/>
+          <w:tab w:val="right" w:leader="none" w:pos="9360"/>
+        </w:tabs>
+        <w:spacing w:after="0" w:before="0" w:line="240" w:lineRule="auto"/>
+        <w:ind w:left="0" w:right="0" w:firstLine="0"/>
+        <w:jc w:val="left"/>
+        <w:rPr>
+          <w:b w:val="1"/>
+        </w:rPr>
+      </w:pPr>
+      <w:r>
+        <w:rPr>
+          <w:rtl w:val="0"/>
+        </w:rPr>
+      </w:r>
+    </w:p>
+    <w:p>
+      <w:pPr>
+        <w:keepNext w:val="0"/>
+        <w:keepLines w:val="0"/>
+        <w:pageBreakBefore w:val="0"/>
+        <w:widowControl w:val="1"/>
+        <w:pBdr>
+          <w:top w:space="0" w:sz="0" w:val="nil"/>
+          <w:left w:space="0" w:sz="0" w:val="nil"/>
+          <w:bottom w:space="0" w:sz="0" w:val="nil"/>
+          <w:right w:space="0" w:sz="0" w:val="nil"/>
+          <w:between w:space="0" w:sz="0" w:val="nil"/>
+        </w:pBdr>
+        <w:shd w:fill="auto" w:val="clear"/>
+        <w:tabs>
+          <w:tab w:val="center" w:leader="none" w:pos="4680"/>
+          <w:tab w:val="right" w:leader="none" w:pos="9360"/>
+        </w:tabs>
+        <w:spacing w:after="0" w:before="0" w:line="240" w:lineRule="auto"/>
+        <w:ind w:left="0" w:right="0" w:firstLine="0"/>
+        <w:jc w:val="left"/>
+        <w:rPr>
+          <w:b w:val="1"/>
+        </w:rPr>
+      </w:pPr>
+      <w:r>
+        <w:rPr>
+          <w:rtl w:val="0"/>
+        </w:rPr>
+      </w:r>
+    </w:p>
+    <w:p>
+      <w:pPr>
+        <w:keepNext w:val="0"/>
+        <w:keepLines w:val="0"/>
+        <w:pageBreakBefore w:val="0"/>
+        <w:widowControl w:val="1"/>
+        <w:pBdr>
+          <w:top w:space="0" w:sz="0" w:val="nil"/>
+          <w:left w:space="0" w:sz="0" w:val="nil"/>
+          <w:bottom w:space="0" w:sz="0" w:val="nil"/>
+          <w:right w:space="0" w:sz="0" w:val="nil"/>
+          <w:between w:space="0" w:sz="0" w:val="nil"/>
+        </w:pBdr>
+        <w:shd w:fill="auto" w:val="clear"/>
+        <w:tabs>
+          <w:tab w:val="center" w:leader="none" w:pos="4680"/>
+          <w:tab w:val="right" w:leader="none" w:pos="9360"/>
+        </w:tabs>
+        <w:spacing w:after="0" w:before="0" w:line="240" w:lineRule="auto"/>
+        <w:ind w:left="0" w:right="0" w:firstLine="0"/>
+        <w:jc w:val="left"/>
+        <w:rPr>
           <w:rFonts w:ascii="Aptos" w:cs="Aptos" w:eastAsia="Aptos" w:hAnsi="Aptos"/>
           <w:b w:val="1"/>
           <w:i w:val="0"/>
@@ -4136,6 +4179,12 @@
   <w:style w:type="table" w:styleId="TableNormal" w:default="1">
     <w:name w:val="TableNormal"/>
   </w:style>
+  <w:style w:type="paragraph" w:styleId="Normal" w:default="1">
+    <w:name w:val="normal"/>
+  </w:style>
+  <w:style w:type="table" w:styleId="TableNormal" w:default="1">
+    <w:name w:val="TableNormal"/>
+  </w:style>
   <w:style w:type="paragraph" w:styleId="Heading7">
     <w:name w:val="heading 7"/>
     <w:basedOn w:val="Normal"/>
@@ -4936,6 +4985,393 @@
     </w:tblStylePr>
   </w:style>
   <w:style w:type="table" w:styleId="Table8">
+    <w:basedOn w:val="TableNormal"/>
+    <w:tblPr>
+      <w:tblStyleRowBandSize w:val="1"/>
+      <w:tblStyleColBandSize w:val="1"/>
+      <w:tblCellMar>
+        <w:top w:w="0.0" w:type="dxa"/>
+        <w:left w:w="108.0" w:type="dxa"/>
+        <w:bottom w:w="0.0" w:type="dxa"/>
+        <w:right w:w="108.0" w:type="dxa"/>
+      </w:tblCellMar>
+    </w:tblPr>
+    <w:tblStylePr w:type="firstCol">
+      <w:rPr>
+        <w:b w:val="1"/>
+      </w:rPr>
+    </w:tblStylePr>
+    <w:tblStylePr w:type="firstRow">
+      <w:rPr>
+        <w:b w:val="1"/>
+      </w:rPr>
+      <w:tcPr>
+        <w:tcBorders>
+          <w:bottom w:color="666666" w:space="0" w:sz="12" w:val="single"/>
+        </w:tcBorders>
+      </w:tcPr>
+    </w:tblStylePr>
+    <w:tblStylePr w:type="lastCol">
+      <w:rPr>
+        <w:b w:val="1"/>
+      </w:rPr>
+    </w:tblStylePr>
+    <w:tblStylePr w:type="lastRow">
+      <w:rPr>
+        <w:b w:val="1"/>
+      </w:rPr>
+      <w:tcPr>
+        <w:tcBorders>
+          <w:top w:color="666666" w:space="0" w:sz="4" w:val="single"/>
+        </w:tcBorders>
+      </w:tcPr>
+    </w:tblStylePr>
+  </w:style>
+  <w:style w:type="table" w:styleId="Table1">
+    <w:basedOn w:val="TableNormal"/>
+    <w:tblPr>
+      <w:tblStyleRowBandSize w:val="1"/>
+      <w:tblStyleColBandSize w:val="1"/>
+      <w:tblCellMar>
+        <w:top w:w="0.0" w:type="dxa"/>
+        <w:left w:w="108.0" w:type="dxa"/>
+        <w:bottom w:w="0.0" w:type="dxa"/>
+        <w:right w:w="108.0" w:type="dxa"/>
+      </w:tblCellMar>
+    </w:tblPr>
+    <w:tblStylePr w:type="firstCol">
+      <w:rPr>
+        <w:b w:val="1"/>
+      </w:rPr>
+    </w:tblStylePr>
+    <w:tblStylePr w:type="firstRow">
+      <w:rPr>
+        <w:b w:val="1"/>
+      </w:rPr>
+      <w:tcPr>
+        <w:tcBorders>
+          <w:bottom w:color="666666" w:space="0" w:sz="12" w:val="single"/>
+        </w:tcBorders>
+      </w:tcPr>
+    </w:tblStylePr>
+    <w:tblStylePr w:type="lastCol">
+      <w:rPr>
+        <w:b w:val="1"/>
+      </w:rPr>
+    </w:tblStylePr>
+    <w:tblStylePr w:type="lastRow">
+      <w:rPr>
+        <w:b w:val="1"/>
+      </w:rPr>
+      <w:tcPr>
+        <w:tcBorders>
+          <w:top w:color="666666" w:space="0" w:sz="4" w:val="single"/>
+        </w:tcBorders>
+      </w:tcPr>
+    </w:tblStylePr>
+  </w:style>
+  <w:style w:type="table" w:styleId="Table2">
+    <w:basedOn w:val="TableNormal"/>
+    <w:tblPr>
+      <w:tblStyleRowBandSize w:val="1"/>
+      <w:tblStyleColBandSize w:val="1"/>
+      <w:tblCellMar>
+        <w:top w:w="0.0" w:type="dxa"/>
+        <w:left w:w="108.0" w:type="dxa"/>
+        <w:bottom w:w="0.0" w:type="dxa"/>
+        <w:right w:w="108.0" w:type="dxa"/>
+      </w:tblCellMar>
+    </w:tblPr>
+    <w:tblStylePr w:type="firstCol">
+      <w:rPr>
+        <w:b w:val="1"/>
+      </w:rPr>
+    </w:tblStylePr>
+    <w:tblStylePr w:type="firstRow">
+      <w:rPr>
+        <w:b w:val="1"/>
+      </w:rPr>
+      <w:tcPr>
+        <w:tcBorders>
+          <w:bottom w:color="666666" w:space="0" w:sz="12" w:val="single"/>
+        </w:tcBorders>
+      </w:tcPr>
+    </w:tblStylePr>
+    <w:tblStylePr w:type="lastCol">
+      <w:rPr>
+        <w:b w:val="1"/>
+      </w:rPr>
+    </w:tblStylePr>
+    <w:tblStylePr w:type="lastRow">
+      <w:rPr>
+        <w:b w:val="1"/>
+      </w:rPr>
+      <w:tcPr>
+        <w:tcBorders>
+          <w:top w:color="666666" w:space="0" w:sz="4" w:val="single"/>
+        </w:tcBorders>
+      </w:tcPr>
+    </w:tblStylePr>
+  </w:style>
+  <w:style w:type="table" w:styleId="Table3">
+    <w:basedOn w:val="TableNormal"/>
+    <w:tblPr>
+      <w:tblStyleRowBandSize w:val="1"/>
+      <w:tblStyleColBandSize w:val="1"/>
+      <w:tblCellMar>
+        <w:top w:w="0.0" w:type="dxa"/>
+        <w:left w:w="108.0" w:type="dxa"/>
+        <w:bottom w:w="0.0" w:type="dxa"/>
+        <w:right w:w="108.0" w:type="dxa"/>
+      </w:tblCellMar>
+    </w:tblPr>
+    <w:tblStylePr w:type="firstCol">
+      <w:rPr>
+        <w:b w:val="1"/>
+      </w:rPr>
+    </w:tblStylePr>
+    <w:tblStylePr w:type="firstRow">
+      <w:rPr>
+        <w:b w:val="1"/>
+      </w:rPr>
+      <w:tcPr>
+        <w:tcBorders>
+          <w:bottom w:color="666666" w:space="0" w:sz="12" w:val="single"/>
+        </w:tcBorders>
+      </w:tcPr>
+    </w:tblStylePr>
+    <w:tblStylePr w:type="lastCol">
+      <w:rPr>
+        <w:b w:val="1"/>
+      </w:rPr>
+    </w:tblStylePr>
+    <w:tblStylePr w:type="lastRow">
+      <w:rPr>
+        <w:b w:val="1"/>
+      </w:rPr>
+      <w:tcPr>
+        <w:tcBorders>
+          <w:top w:color="666666" w:space="0" w:sz="4" w:val="single"/>
+        </w:tcBorders>
+      </w:tcPr>
+    </w:tblStylePr>
+  </w:style>
+  <w:style w:type="table" w:styleId="Table4">
+    <w:basedOn w:val="TableNormal"/>
+    <w:tblPr>
+      <w:tblStyleRowBandSize w:val="1"/>
+      <w:tblStyleColBandSize w:val="1"/>
+      <w:tblCellMar>
+        <w:top w:w="0.0" w:type="dxa"/>
+        <w:left w:w="108.0" w:type="dxa"/>
+        <w:bottom w:w="0.0" w:type="dxa"/>
+        <w:right w:w="108.0" w:type="dxa"/>
+      </w:tblCellMar>
+    </w:tblPr>
+    <w:tblStylePr w:type="firstCol">
+      <w:rPr>
+        <w:b w:val="1"/>
+      </w:rPr>
+    </w:tblStylePr>
+    <w:tblStylePr w:type="firstRow">
+      <w:rPr>
+        <w:b w:val="1"/>
+      </w:rPr>
+      <w:tcPr>
+        <w:tcBorders>
+          <w:bottom w:color="666666" w:space="0" w:sz="12" w:val="single"/>
+        </w:tcBorders>
+      </w:tcPr>
+    </w:tblStylePr>
+    <w:tblStylePr w:type="lastCol">
+      <w:rPr>
+        <w:b w:val="1"/>
+      </w:rPr>
+    </w:tblStylePr>
+    <w:tblStylePr w:type="lastRow">
+      <w:rPr>
+        <w:b w:val="1"/>
+      </w:rPr>
+      <w:tcPr>
+        <w:tcBorders>
+          <w:top w:color="666666" w:space="0" w:sz="4" w:val="single"/>
+        </w:tcBorders>
+      </w:tcPr>
+    </w:tblStylePr>
+  </w:style>
+  <w:style w:type="table" w:styleId="Table5">
+    <w:basedOn w:val="TableNormal"/>
+    <w:tblPr>
+      <w:tblStyleRowBandSize w:val="1"/>
+      <w:tblStyleColBandSize w:val="1"/>
+      <w:tblCellMar>
+        <w:top w:w="0.0" w:type="dxa"/>
+        <w:left w:w="108.0" w:type="dxa"/>
+        <w:bottom w:w="0.0" w:type="dxa"/>
+        <w:right w:w="108.0" w:type="dxa"/>
+      </w:tblCellMar>
+    </w:tblPr>
+    <w:tblStylePr w:type="firstCol">
+      <w:rPr>
+        <w:b w:val="1"/>
+      </w:rPr>
+    </w:tblStylePr>
+    <w:tblStylePr w:type="firstRow">
+      <w:rPr>
+        <w:b w:val="1"/>
+      </w:rPr>
+      <w:tcPr>
+        <w:tcBorders>
+          <w:bottom w:color="666666" w:space="0" w:sz="12" w:val="single"/>
+        </w:tcBorders>
+      </w:tcPr>
+    </w:tblStylePr>
+    <w:tblStylePr w:type="lastCol">
+      <w:rPr>
+        <w:b w:val="1"/>
+      </w:rPr>
+    </w:tblStylePr>
+    <w:tblStylePr w:type="lastRow">
+      <w:rPr>
+        <w:b w:val="1"/>
+      </w:rPr>
+      <w:tcPr>
+        <w:tcBorders>
+          <w:top w:color="666666" w:space="0" w:sz="4" w:val="single"/>
+        </w:tcBorders>
+      </w:tcPr>
+    </w:tblStylePr>
+  </w:style>
+  <w:style w:type="table" w:styleId="Table6">
+    <w:basedOn w:val="TableNormal"/>
+    <w:tblPr>
+      <w:tblStyleRowBandSize w:val="1"/>
+      <w:tblStyleColBandSize w:val="1"/>
+      <w:tblCellMar>
+        <w:top w:w="0.0" w:type="dxa"/>
+        <w:left w:w="108.0" w:type="dxa"/>
+        <w:bottom w:w="0.0" w:type="dxa"/>
+        <w:right w:w="108.0" w:type="dxa"/>
+      </w:tblCellMar>
+    </w:tblPr>
+    <w:tblStylePr w:type="firstCol">
+      <w:rPr>
+        <w:b w:val="1"/>
+      </w:rPr>
+    </w:tblStylePr>
+    <w:tblStylePr w:type="firstRow">
+      <w:rPr>
+        <w:b w:val="1"/>
+      </w:rPr>
+      <w:tcPr>
+        <w:tcBorders>
+          <w:bottom w:color="666666" w:space="0" w:sz="12" w:val="single"/>
+        </w:tcBorders>
+      </w:tcPr>
+    </w:tblStylePr>
+    <w:tblStylePr w:type="lastCol">
+      <w:rPr>
+        <w:b w:val="1"/>
+      </w:rPr>
+    </w:tblStylePr>
+    <w:tblStylePr w:type="lastRow">
+      <w:rPr>
+        <w:b w:val="1"/>
+      </w:rPr>
+      <w:tcPr>
+        <w:tcBorders>
+          <w:top w:color="666666" w:space="0" w:sz="4" w:val="single"/>
+        </w:tcBorders>
+      </w:tcPr>
+    </w:tblStylePr>
+  </w:style>
+  <w:style w:type="table" w:styleId="Table7">
+    <w:basedOn w:val="TableNormal"/>
+    <w:tblPr>
+      <w:tblStyleRowBandSize w:val="1"/>
+      <w:tblStyleColBandSize w:val="1"/>
+      <w:tblCellMar>
+        <w:top w:w="0.0" w:type="dxa"/>
+        <w:left w:w="108.0" w:type="dxa"/>
+        <w:bottom w:w="0.0" w:type="dxa"/>
+        <w:right w:w="108.0" w:type="dxa"/>
+      </w:tblCellMar>
+    </w:tblPr>
+    <w:tblStylePr w:type="firstCol">
+      <w:rPr>
+        <w:b w:val="1"/>
+      </w:rPr>
+    </w:tblStylePr>
+    <w:tblStylePr w:type="firstRow">
+      <w:rPr>
+        <w:b w:val="1"/>
+      </w:rPr>
+      <w:tcPr>
+        <w:tcBorders>
+          <w:bottom w:color="666666" w:space="0" w:sz="12" w:val="single"/>
+        </w:tcBorders>
+      </w:tcPr>
+    </w:tblStylePr>
+    <w:tblStylePr w:type="lastCol">
+      <w:rPr>
+        <w:b w:val="1"/>
+      </w:rPr>
+    </w:tblStylePr>
+    <w:tblStylePr w:type="lastRow">
+      <w:rPr>
+        <w:b w:val="1"/>
+      </w:rPr>
+      <w:tcPr>
+        <w:tcBorders>
+          <w:top w:color="666666" w:space="0" w:sz="4" w:val="single"/>
+        </w:tcBorders>
+      </w:tcPr>
+    </w:tblStylePr>
+  </w:style>
+  <w:style w:type="table" w:styleId="Table8">
+    <w:basedOn w:val="TableNormal"/>
+    <w:tblPr>
+      <w:tblStyleRowBandSize w:val="1"/>
+      <w:tblStyleColBandSize w:val="1"/>
+      <w:tblCellMar>
+        <w:top w:w="0.0" w:type="dxa"/>
+        <w:left w:w="108.0" w:type="dxa"/>
+        <w:bottom w:w="0.0" w:type="dxa"/>
+        <w:right w:w="108.0" w:type="dxa"/>
+      </w:tblCellMar>
+    </w:tblPr>
+    <w:tblStylePr w:type="firstCol">
+      <w:rPr>
+        <w:b w:val="1"/>
+      </w:rPr>
+    </w:tblStylePr>
+    <w:tblStylePr w:type="firstRow">
+      <w:rPr>
+        <w:b w:val="1"/>
+      </w:rPr>
+      <w:tcPr>
+        <w:tcBorders>
+          <w:bottom w:color="666666" w:space="0" w:sz="12" w:val="single"/>
+        </w:tcBorders>
+      </w:tcPr>
+    </w:tblStylePr>
+    <w:tblStylePr w:type="lastCol">
+      <w:rPr>
+        <w:b w:val="1"/>
+      </w:rPr>
+    </w:tblStylePr>
+    <w:tblStylePr w:type="lastRow">
+      <w:rPr>
+        <w:b w:val="1"/>
+      </w:rPr>
+      <w:tcPr>
+        <w:tcBorders>
+          <w:top w:color="666666" w:space="0" w:sz="4" w:val="single"/>
+        </w:tcBorders>
+      </w:tcPr>
+    </w:tblStylePr>
+  </w:style>
+  <w:style w:type="table" w:styleId="Table9">
     <w:basedOn w:val="TableNormal"/>
     <w:tblPr>
       <w:tblStyleRowBandSize w:val="1"/>
@@ -5678,7 +6114,7 @@
 
 <file path=customXML/item1.xml><?xml version="1.0" encoding="utf-8"?>
 <go:gDocsCustomXmlDataStorage xmlns:go="http://customooxmlschemas.google.com/" xmlns:r="http://schemas.openxmlformats.org/officeDocument/2006/relationships" uri="GoogleDocsCustomDataVersion2">
-  <go:docsCustomData xmlns:go="http://customooxmlschemas.google.com/" roundtripDataSignature="AMtx7mgUf/erA5udm8LAqHBkcNlMiDlihQ==">CgMxLjA4AHIhMTltTk8wVW53Tk1OWklxYWtnTGpwUzBjVEtXOXViLXNi</go:docsCustomData>
+  <go:docsCustomData xmlns:go="http://customooxmlschemas.google.com/" roundtripDataSignature="AMtx7mgfGzvuOSHgf8o0evA6Qt5VuCdztQ==">CgMxLjA4AHIhMVNnMktRUlBUcGJfNmRCNGVMeXM0MndVME04dXhYbzZs</go:docsCustomData>
 </go:gDocsCustomXmlDataStorage>
 </file>
 

</xml_diff>